<commit_message>
Resumo de atividade — 4 de setembro de 2026
</commit_message>
<xml_diff>
--- a/Resumo_atividade/Resumo_atividade_SurveyOS_20260904.docx
+++ b/Resumo_atividade/Resumo_atividade_SurveyOS_20260904.docx
@@ -49,7 +49,7 @@
           <w:sz w:val="18"/>
           <w:szCs w:val="18"/>
         </w:rPr>
-        <w:t xml:space="preserve">Posição em 4 de setembro de 2026   ·   45 ordens de serviço avaliadas   ·   Redes — PR, MG, SP</w:t>
+        <w:t xml:space="preserve">Posição em 4 de setembro de 2026   ·   47 ordens de serviço avaliadas   ·   Redes — PR, MG, SP</w:t>
       </w:r>
     </w:p>
     <w:tbl>
@@ -96,7 +96,7 @@
                 <w:sz w:val="24"/>
                 <w:szCs w:val="24"/>
               </w:rPr>
-              <w:t xml:space="preserve">Das 45 ordens avaliadas, 38 foram encerradas. PR concluiu 18 das 21 abertas na região; MG concluiu 16 das 19 abertas na região; SP concluiu 4 das 5 abertas na região. Todas as regiões têm técnico atribuído em ao menos uma ordem.</w:t>
+              <w:t xml:space="preserve">Das 47 ordens avaliadas, 38 foram encerradas. PR concluiu 18 das 22 abertas na região; MG concluiu 16 das 20 abertas na região; SP concluiu 4 das 5 abertas na região. Todas as regiões têm técnico atribuído em ao menos uma ordem.</w:t>
             </w:r>
           </w:p>
         </w:tc>
@@ -155,7 +155,7 @@
                 <w:sz w:val="44"/>
                 <w:szCs w:val="44"/>
               </w:rPr>
-              <w:t xml:space="preserve">45</w:t>
+              <w:t xml:space="preserve">47</w:t>
             </w:r>
           </w:p>
           <w:p>
@@ -255,7 +255,7 @@
                 <w:sz w:val="44"/>
                 <w:szCs w:val="44"/>
               </w:rPr>
-              <w:t xml:space="preserve">3</w:t>
+              <w:t xml:space="preserve">4</w:t>
             </w:r>
           </w:p>
           <w:p>
@@ -305,7 +305,7 @@
                 <w:sz w:val="44"/>
                 <w:szCs w:val="44"/>
               </w:rPr>
-              <w:t xml:space="preserve">0</w:t>
+              <w:t xml:space="preserve">1</w:t>
             </w:r>
           </w:p>
           <w:p>
@@ -361,7 +361,7 @@
           <w:sz w:val="20"/>
           <w:szCs w:val="20"/>
         </w:rPr>
-        <w:t xml:space="preserve">PR tem técnico atribuído em 21 das 21 ordens, com 18 encerradas. MG tem técnico atribuído em 17 das 19 ordens, com 16 encerradas. SP tem técnico atribuído em 4 das 5 ordens, com 4 encerradas.</w:t>
+        <w:t xml:space="preserve">PR tem técnico atribuído em 21 das 22 ordens, com 18 encerradas. MG tem técnico atribuído em 18 das 20 ordens, com 16 encerradas. SP tem técnico atribuído em 4 das 5 ordens, com 4 encerradas.</w:t>
       </w:r>
     </w:p>
     <w:tbl>
@@ -718,7 +718,7 @@
                 <w:sz w:val="24"/>
                 <w:szCs w:val="24"/>
               </w:rPr>
-              <w:t xml:space="preserve">21</w:t>
+              <w:t xml:space="preserve">22</w:t>
             </w:r>
           </w:p>
         </w:tc>
@@ -752,7 +752,7 @@
                 <w:sz w:val="24"/>
                 <w:szCs w:val="24"/>
               </w:rPr>
-              <w:t xml:space="preserve">19</w:t>
+              <w:t xml:space="preserve">20</w:t>
             </w:r>
           </w:p>
         </w:tc>
@@ -887,7 +887,7 @@
                 <w:sz w:val="24"/>
                 <w:szCs w:val="24"/>
               </w:rPr>
-              <w:t xml:space="preserve">17</w:t>
+              <w:t xml:space="preserve">18</w:t>
             </w:r>
           </w:p>
         </w:tc>
@@ -1147,7 +1147,7 @@
                 <w:sz w:val="30"/>
                 <w:szCs w:val="30"/>
               </w:rPr>
-              <w:t xml:space="preserve">8,0</w:t>
+              <w:t xml:space="preserve">8,5</w:t>
             </w:r>
           </w:p>
           <w:p>

</xml_diff>